<commit_message>
Tira a analise de despesas do projeto de logistica
As despesas sao de outro projeto, nao deste sistema.

- carga_inicial_despesas.sql saiu da pasta (foi para OneDrive\Documentos,
  junto do Excel de origem).
- supabase-setup.sql: removido o bloco MODULO DESPESAS (tabelas despesas,
  despesas_faturamento e metas). Ficaram as 7 tabelas de logistica. O bloco
  foi preservado em OneDrive\Documentos\supabase-despesas.sql.
- Documentacao, apresentacao e roteiro: retiradas as mencoes ao modulo de
  Despesas como proximo passo deste sistema.

Co-Authored-By: Claude Opus 5 <noreply@anthropic.com>
</commit_message>
<xml_diff>
--- a/Documentacao_Sistema_Gestao_Logistica_Dilnor.docx
+++ b/Documentacao_Sistema_Gestao_Logistica_Dilnor.docx
@@ -495,66 +495,6 @@
                 <w:szCs w:val="20"/>
               </w:rPr>
               <w:t xml:space="preserve">12</w:t>
-            </w:r>
-          </w:p>
-        </w:tc>
-      </w:tr>
-      <w:tr>
-        <w:tc>
-          <w:tcPr>
-            <w:tcW w:type="dxa" w:w="5400"/>
-            <w:shd w:fill="F2F3F5" w:color="auto" w:val="clear"/>
-            <w:tcMar>
-              <w:top w:type="dxa" w:w="90"/>
-              <w:left w:type="dxa" w:w="110"/>
-              <w:bottom w:type="dxa" w:w="90"/>
-              <w:right w:type="dxa" w:w="110"/>
-            </w:tcMar>
-            <w:vAlign w:val="center"/>
-          </w:tcPr>
-          <w:p>
-            <w:pPr>
-              <w:jc w:val="left"/>
-            </w:pPr>
-            <w:r>
-              <w:rPr>
-                <w:rFonts w:ascii="Calibri" w:cs="Calibri" w:eastAsia="Calibri" w:hAnsi="Calibri"/>
-                <w:b w:val="false"/>
-                <w:bCs w:val="false"/>
-                <w:color w:val="2B2F36"/>
-                <w:sz w:val="20"/>
-                <w:szCs w:val="20"/>
-              </w:rPr>
-              <w:t xml:space="preserve">Registros históricos de despesas já migrados</w:t>
-            </w:r>
-          </w:p>
-        </w:tc>
-        <w:tc>
-          <w:tcPr>
-            <w:tcW w:type="dxa" w:w="3780"/>
-            <w:shd w:fill="F2F3F5" w:color="auto" w:val="clear"/>
-            <w:tcMar>
-              <w:top w:type="dxa" w:w="90"/>
-              <w:left w:type="dxa" w:w="110"/>
-              <w:bottom w:type="dxa" w:w="90"/>
-              <w:right w:type="dxa" w:w="110"/>
-            </w:tcMar>
-            <w:vAlign w:val="center"/>
-          </w:tcPr>
-          <w:p>
-            <w:pPr>
-              <w:jc w:val="right"/>
-            </w:pPr>
-            <w:r>
-              <w:rPr>
-                <w:rFonts w:ascii="Calibri" w:cs="Calibri" w:eastAsia="Calibri" w:hAnsi="Calibri"/>
-                <w:b/>
-                <w:bCs/>
-                <w:color w:val="14315B"/>
-                <w:sz w:val="20"/>
-                <w:szCs w:val="20"/>
-              </w:rPr>
-              <w:t xml:space="preserve">3.419 (2022–2026)</w:t>
             </w:r>
           </w:p>
         </w:tc>
@@ -2652,7 +2592,7 @@
           <w:sz w:val="30"/>
           <w:szCs w:val="30"/>
         </w:rPr>
-        <w:t xml:space="preserve">Próximos passos</w:t>
+        <w:t xml:space="preserve">Em resumo</w:t>
       </w:r>
     </w:p>
     <w:p>
@@ -2666,7 +2606,7 @@
           <w:sz w:val="21"/>
           <w:szCs w:val="21"/>
         </w:rPr>
-        <w:t xml:space="preserve">Já existe uma base pronta para o próximo módulo, de Despesas: 3.419 registros históricos da Dilnor (2022 a 2026) já foram carregados no banco de dados, cobrindo aluguel, salários e demais contas do balancete mensal. Falta apenas construir a tela — o trabalho pesado de organizar o histórico já está feito.</w:t>
+        <w:t xml:space="preserve">Em seis semanas, um sistema único passou a cobrir análise de entregas, produtividade e premiação, escala de carregamento, portaria, controle de estoque e agendamento de cargas para as duas unidades — com histórico guardado, acesso controlado por perfil e sem depender de planilhas espalhadas.</w:t>
       </w:r>
     </w:p>
     <w:p>
@@ -2680,41 +2620,7 @@
           <w:sz w:val="21"/>
           <w:szCs w:val="21"/>
         </w:rPr>
-        <w:t xml:space="preserve">Quando concluído, esse módulo vai comparar, mês a mês, o que foi gasto contra o que foi orçado (meta), por grupo de conta — visão que hoje depende de cruzar planilhas manualmente.</w:t>
-      </w:r>
-    </w:p>
-    <w:p>
-      <w:pPr>
-        <w:pStyle w:val="Heading1"/>
-        <w:pBdr>
-          <w:bottom w:val="single" w:color="D9A420" w:sz="12" w:space="4"/>
-        </w:pBdr>
-        <w:spacing w:after="200" w:before="420"/>
-      </w:pPr>
-      <w:r>
-        <w:rPr>
-          <w:rFonts w:ascii="Calibri" w:cs="Calibri" w:eastAsia="Calibri" w:hAnsi="Calibri"/>
-          <w:b/>
-          <w:bCs/>
-          <w:color w:val="14315B"/>
-          <w:sz w:val="30"/>
-          <w:szCs w:val="30"/>
-        </w:rPr>
-        <w:t xml:space="preserve">Em resumo</w:t>
-      </w:r>
-    </w:p>
-    <w:p>
-      <w:pPr>
-        <w:spacing w:after="160" w:line="300"/>
-      </w:pPr>
-      <w:r>
-        <w:rPr>
-          <w:rFonts w:ascii="Calibri" w:cs="Calibri" w:eastAsia="Calibri" w:hAnsi="Calibri"/>
-          <w:color w:val="2B2F36"/>
-          <w:sz w:val="21"/>
-          <w:szCs w:val="21"/>
-        </w:rPr>
-        <w:t xml:space="preserve">Em seis semanas, um sistema único passou a cobrir análise de entregas, produtividade e premiação, escala de carregamento, portaria, controle de estoque e agendamento de cargas para as duas unidades — com histórico guardado, acesso controlado por perfil e sem depender de planilhas espalhadas. O próximo passo natural é o módulo de Despesas, cuja base de dados já está pronta.</w:t>
+        <w:t xml:space="preserve">O sistema segue em evolução: cada melhoria entra em produção assim que fica pronta, sem parada e sem instalação nas máquinas da equipe.</w:t>
       </w:r>
     </w:p>
     <w:sectPr>

</xml_diff>